<commit_message>
Incorpora melhorias de conteúdo DAIR/ANPD/ransomware e aplica ABNT NBR 14724 rigorosa aos 4 DOCX
Conteúdo: 4 hipóteses de extinção do processo ANPD (Resolução nº 15/2024, art. 23),
registro obrigatório do motivo de não comunicar, "ampla divulgação" como poder coercitivo
da ANPD, matriz de severidade de 3 eixos como referência opcional, novo anexo de
ransomware no Plano (autoridade de pagamento, canal fora de banda, restauração de
backups, investigação de intrusão ampla), vínculo relatório final/RIPD, indicador de
pontualidade de comunicação à ANPD, e referência à ISO 22361:2022.

Formatação: Times New Roman 12pt (substitui Arial), Sumário como campo TOC dinâmico,
títulos em estilos nativos Heading 1/2/3 do Word, numeração de títulos via lista
multinível vinculada aos estilos Heading (gerada automaticamente, nunca mais texto
manual embutido).

Co-Authored-By: Claude Sonnet 5 <noreply@anthropic.com>
Claude-Session: https://claude.ai/code/session_019BUciMiJ9NpL2e53Cpz4hF
</commit_message>
<xml_diff>
--- a/instrumentos/word/DAIR_Kit_Preparacao_Comunicacoes_ANPD_Titulares_v0.3.docx
+++ b/instrumentos/word/DAIR_Kit_Preparacao_Comunicacoes_ANPD_Titulares_v0.3.docx
@@ -121,18 +121,45 @@
         <w:br w:type="page"/>
       </w:r>
     </w:p>
+    <w:sdt>
+      <w:sdtPr>
+        <w:alias w:val="Sumário"/>
+      </w:sdtPr>
+      <w:sdtContent>
+        <w:p>
+          <w:r>
+            <w:fldChar w:fldCharType="begin" w:dirty="true"/>
+            <w:instrText xml:space="preserve">TOC \h \o "1-2"</w:instrText>
+            <w:fldChar w:fldCharType="separate"/>
+          </w:r>
+        </w:p>
+        <w:p>
+          <w:r>
+            <w:fldChar w:fldCharType="end"/>
+          </w:r>
+        </w:p>
+      </w:sdtContent>
+    </w:sdt>
+    <w:p>
+      <w:r>
+        <w:br w:type="page"/>
+      </w:r>
+    </w:p>
     <w:p>
       <w:pPr>
         <w:pStyle w:val="Heading1"/>
         <w:spacing w:after="160" w:before="360"/>
+        <w:ind w:firstLine="0"/>
       </w:pPr>
       <w:r>
-        <w:t xml:space="preserve">A. Preparação para a Comunicação à ANPD</w:t>
+        <w:t xml:space="preserve">Preparação para a Comunicação à ANPD</w:t>
       </w:r>
     </w:p>
     <w:p>
       <w:pPr>
-        <w:spacing w:after="200"/>
+        <w:spacing w:after="200" w:line="360" w:lineRule="auto"/>
+        <w:ind w:firstLine="709"/>
+        <w:jc w:val="both"/>
       </w:pPr>
       <w:r>
         <w:rPr>
@@ -149,9 +176,10 @@
       <w:pPr>
         <w:pStyle w:val="Heading2"/>
         <w:spacing w:after="120" w:before="200"/>
+        <w:ind w:firstLine="0"/>
       </w:pPr>
       <w:r>
-        <w:t xml:space="preserve">A.1 Conteúdo mínimo do art. 6º, §2º, do RCIS (itens I a XII)</w:t>
+        <w:t xml:space="preserve">Conteúdo mínimo do art. 6º, §2º, do RCIS (itens I a XII)</w:t>
       </w:r>
     </w:p>
     <w:tbl>
@@ -1219,9 +1247,10 @@
       <w:pPr>
         <w:pStyle w:val="Heading2"/>
         <w:spacing w:after="120" w:before="200"/>
+        <w:ind w:firstLine="0"/>
       </w:pPr>
       <w:r>
-        <w:t xml:space="preserve">A.2 Formulário oficial e peticionamento no SEI!ANPD</w:t>
+        <w:t xml:space="preserve">Formulário oficial e peticionamento no SEI!ANPD</w:t>
       </w:r>
     </w:p>
     <w:p>
@@ -1238,7 +1267,9 @@
     </w:p>
     <w:p>
       <w:pPr>
-        <w:spacing w:after="140"/>
+        <w:spacing w:after="140" w:line="360" w:lineRule="auto"/>
+        <w:ind w:firstLine="709"/>
+        <w:jc w:val="both"/>
       </w:pPr>
       <w:r>
         <w:rPr>
@@ -1262,7 +1293,9 @@
     </w:p>
     <w:p>
       <w:pPr>
-        <w:spacing w:after="140"/>
+        <w:spacing w:after="140" w:line="360" w:lineRule="auto"/>
+        <w:ind w:firstLine="709"/>
+        <w:jc w:val="both"/>
       </w:pPr>
       <w:r>
         <w:rPr>
@@ -1288,14 +1321,17 @@
       <w:pPr>
         <w:pStyle w:val="Heading2"/>
         <w:spacing w:after="120" w:before="200"/>
+        <w:ind w:firstLine="0"/>
       </w:pPr>
       <w:r>
-        <w:t xml:space="preserve">A.3 Representação, documentos complementares e classificação de acesso</w:t>
+        <w:t xml:space="preserve">Representação, documentos complementares e classificação de acesso</w:t>
       </w:r>
     </w:p>
     <w:p>
       <w:pPr>
-        <w:spacing w:after="140"/>
+        <w:spacing w:after="140" w:line="360" w:lineRule="auto"/>
+        <w:ind w:firstLine="709"/>
+        <w:jc w:val="both"/>
       </w:pPr>
       <w:r>
         <w:rPr>
@@ -1319,7 +1355,9 @@
     </w:p>
     <w:p>
       <w:pPr>
-        <w:spacing w:after="140"/>
+        <w:spacing w:after="140" w:line="360" w:lineRule="auto"/>
+        <w:ind w:firstLine="709"/>
+        <w:jc w:val="both"/>
       </w:pPr>
       <w:r>
         <w:rPr>
@@ -1343,7 +1381,9 @@
     </w:p>
     <w:p>
       <w:pPr>
-        <w:spacing w:after="140"/>
+        <w:spacing w:after="140" w:line="360" w:lineRule="auto"/>
+        <w:ind w:firstLine="709"/>
+        <w:jc w:val="both"/>
       </w:pPr>
       <w:r>
         <w:rPr>
@@ -1705,14 +1745,17 @@
       <w:pPr>
         <w:pStyle w:val="Heading2"/>
         <w:spacing w:after="120" w:before="200"/>
+        <w:ind w:firstLine="0"/>
       </w:pPr>
       <w:r>
-        <w:t xml:space="preserve">A.4 Pendências e controle de preparação</w:t>
+        <w:t xml:space="preserve">Pendências e controle de preparação</w:t>
       </w:r>
     </w:p>
     <w:p>
       <w:pPr>
-        <w:spacing w:after="140"/>
+        <w:spacing w:after="140" w:line="360" w:lineRule="auto"/>
+        <w:ind w:firstLine="709"/>
+        <w:jc w:val="both"/>
       </w:pPr>
       <w:r>
         <w:rPr>
@@ -1736,7 +1779,9 @@
     </w:p>
     <w:p>
       <w:pPr>
-        <w:spacing w:after="140"/>
+        <w:spacing w:after="140" w:line="360" w:lineRule="auto"/>
+        <w:ind w:firstLine="709"/>
+        <w:jc w:val="both"/>
       </w:pPr>
       <w:r>
         <w:rPr>
@@ -1760,7 +1805,9 @@
     </w:p>
     <w:p>
       <w:pPr>
-        <w:spacing w:after="140"/>
+        <w:spacing w:after="140" w:line="360" w:lineRule="auto"/>
+        <w:ind w:firstLine="709"/>
+        <w:jc w:val="both"/>
       </w:pPr>
       <w:r>
         <w:rPr>
@@ -1784,7 +1831,9 @@
     </w:p>
     <w:p>
       <w:pPr>
-        <w:spacing w:after="140"/>
+        <w:spacing w:after="140" w:line="360" w:lineRule="auto"/>
+        <w:ind w:firstLine="709"/>
+        <w:jc w:val="both"/>
       </w:pPr>
       <w:r>
         <w:rPr>
@@ -1808,7 +1857,9 @@
     </w:p>
     <w:p>
       <w:pPr>
-        <w:spacing w:after="140"/>
+        <w:spacing w:after="140" w:line="360" w:lineRule="auto"/>
+        <w:ind w:firstLine="709"/>
+        <w:jc w:val="both"/>
       </w:pPr>
       <w:r>
         <w:rPr>
@@ -1832,7 +1883,9 @@
     </w:p>
     <w:p>
       <w:pPr>
-        <w:spacing w:after="140"/>
+        <w:spacing w:after="140" w:line="360" w:lineRule="auto"/>
+        <w:ind w:firstLine="709"/>
+        <w:jc w:val="both"/>
       </w:pPr>
       <w:r>
         <w:rPr>
@@ -1858,14 +1911,17 @@
       <w:pPr>
         <w:pStyle w:val="Heading1"/>
         <w:spacing w:after="160" w:before="360"/>
+        <w:ind w:firstLine="0"/>
       </w:pPr>
       <w:r>
-        <w:t xml:space="preserve">B. Preparação da Comunicação aos Titulares</w:t>
+        <w:t xml:space="preserve">Preparação da Comunicação aos Titulares</w:t>
       </w:r>
     </w:p>
     <w:p>
       <w:pPr>
-        <w:spacing w:after="200"/>
+        <w:spacing w:after="200" w:line="360" w:lineRule="auto"/>
+        <w:ind w:firstLine="709"/>
+        <w:jc w:val="both"/>
       </w:pPr>
       <w:r>
         <w:rPr>
@@ -1882,9 +1938,10 @@
       <w:pPr>
         <w:pStyle w:val="Heading2"/>
         <w:spacing w:after="120" w:before="200"/>
+        <w:ind w:firstLine="0"/>
       </w:pPr>
       <w:r>
-        <w:t xml:space="preserve">B.1 Conteúdo mínimo (art. 9º, caput): elementos obrigatórios</w:t>
+        <w:t xml:space="preserve">Conteúdo mínimo (art. 9º, caput): elementos obrigatórios</w:t>
       </w:r>
     </w:p>
     <w:tbl>
@@ -2379,14 +2436,17 @@
       <w:pPr>
         <w:pStyle w:val="Heading2"/>
         <w:spacing w:after="120" w:before="200"/>
+        <w:ind w:firstLine="0"/>
       </w:pPr>
       <w:r>
-        <w:t xml:space="preserve">B.2 Revisão de conteúdo, canal, alcance e acessibilidade</w:t>
+        <w:t xml:space="preserve">Revisão de conteúdo, canal, alcance e acessibilidade</w:t>
       </w:r>
     </w:p>
     <w:p>
       <w:pPr>
-        <w:spacing w:after="140"/>
+        <w:spacing w:after="140" w:line="360" w:lineRule="auto"/>
+        <w:ind w:firstLine="709"/>
+        <w:jc w:val="both"/>
       </w:pPr>
       <w:r>
         <w:rPr>
@@ -2410,7 +2470,9 @@
     </w:p>
     <w:p>
       <w:pPr>
-        <w:spacing w:after="140"/>
+        <w:spacing w:after="140" w:line="360" w:lineRule="auto"/>
+        <w:ind w:firstLine="709"/>
+        <w:jc w:val="both"/>
       </w:pPr>
       <w:r>
         <w:rPr>
@@ -2434,7 +2496,9 @@
     </w:p>
     <w:p>
       <w:pPr>
-        <w:spacing w:after="140"/>
+        <w:spacing w:after="140" w:line="360" w:lineRule="auto"/>
+        <w:ind w:firstLine="709"/>
+        <w:jc w:val="both"/>
       </w:pPr>
       <w:r>
         <w:rPr>
@@ -2458,7 +2522,9 @@
     </w:p>
     <w:p>
       <w:pPr>
-        <w:spacing w:after="140"/>
+        <w:spacing w:after="140" w:line="360" w:lineRule="auto"/>
+        <w:ind w:firstLine="709"/>
+        <w:jc w:val="both"/>
       </w:pPr>
       <w:r>
         <w:rPr>
@@ -2482,7 +2548,9 @@
     </w:p>
     <w:p>
       <w:pPr>
-        <w:spacing w:after="140"/>
+        <w:spacing w:after="140" w:line="360" w:lineRule="auto"/>
+        <w:ind w:firstLine="709"/>
+        <w:jc w:val="both"/>
       </w:pPr>
       <w:r>
         <w:rPr>
@@ -2508,14 +2576,17 @@
       <w:pPr>
         <w:pStyle w:val="Heading2"/>
         <w:spacing w:after="120" w:before="200"/>
+        <w:ind w:firstLine="0"/>
       </w:pPr>
       <w:r>
-        <w:t xml:space="preserve">B.3 Divulgação pública alternativa: preparação (quando a comunicação direta for inviável, art. 9º, §3º)</w:t>
+        <w:t xml:space="preserve">Divulgação pública alternativa: preparação (quando a comunicação direta for inviável, art. 9º, §3º)</w:t>
       </w:r>
     </w:p>
     <w:p>
       <w:pPr>
-        <w:spacing w:after="140"/>
+        <w:spacing w:after="140" w:line="360" w:lineRule="auto"/>
+        <w:ind w:firstLine="709"/>
+        <w:jc w:val="both"/>
       </w:pPr>
       <w:r>
         <w:rPr>
@@ -2539,7 +2610,9 @@
     </w:p>
     <w:p>
       <w:pPr>
-        <w:spacing w:after="140"/>
+        <w:spacing w:after="140" w:line="360" w:lineRule="auto"/>
+        <w:ind w:firstLine="709"/>
+        <w:jc w:val="both"/>
       </w:pPr>
       <w:r>
         <w:rPr>
@@ -2563,7 +2636,9 @@
     </w:p>
     <w:p>
       <w:pPr>
-        <w:spacing w:after="140"/>
+        <w:spacing w:after="140" w:line="360" w:lineRule="auto"/>
+        <w:ind w:firstLine="709"/>
+        <w:jc w:val="both"/>
       </w:pPr>
       <w:r>
         <w:rPr>
@@ -2589,14 +2664,17 @@
       <w:pPr>
         <w:pStyle w:val="Heading1"/>
         <w:spacing w:after="160" w:before="360"/>
+        <w:ind w:firstLine="0"/>
       </w:pPr>
       <w:r>
-        <w:t xml:space="preserve">C. Controle da Execução</w:t>
+        <w:t xml:space="preserve">Controle da Execução</w:t>
       </w:r>
     </w:p>
     <w:p>
       <w:pPr>
-        <w:spacing w:after="200"/>
+        <w:spacing w:after="200" w:line="360" w:lineRule="auto"/>
+        <w:ind w:firstLine="709"/>
+        <w:jc w:val="both"/>
       </w:pPr>
       <w:r>
         <w:rPr>
@@ -2626,8 +2704,9 @@
     </w:p>
     <w:p>
       <w:pPr>
-        <w:pStyle w:val="Heading2"/>
+        <w:pStyle w:val="Heading3"/>
         <w:spacing w:after="80" w:before="240"/>
+        <w:ind w:firstLine="0"/>
       </w:pPr>
       <w:r>
         <w:t xml:space="preserve">Comunicação inicial à ANPD</w:t>
@@ -3112,8 +3191,9 @@
     </w:tbl>
     <w:p>
       <w:pPr>
-        <w:pStyle w:val="Heading2"/>
+        <w:pStyle w:val="Heading3"/>
         <w:spacing w:after="80" w:before="240"/>
+        <w:ind w:firstLine="0"/>
       </w:pPr>
       <w:r>
         <w:t xml:space="preserve">Complementação à ANPD: registro nº 1</w:t>
@@ -3121,7 +3201,9 @@
     </w:p>
     <w:p>
       <w:pPr>
-        <w:spacing w:after="80"/>
+        <w:spacing w:after="80" w:line="360" w:lineRule="auto"/>
+        <w:ind w:firstLine="709"/>
+        <w:jc w:val="both"/>
       </w:pPr>
       <w:r>
         <w:rPr>
@@ -3613,8 +3695,9 @@
     </w:tbl>
     <w:p>
       <w:pPr>
-        <w:pStyle w:val="Heading2"/>
+        <w:pStyle w:val="Heading3"/>
         <w:spacing w:after="80" w:before="240"/>
+        <w:ind w:firstLine="0"/>
       </w:pPr>
       <w:r>
         <w:t xml:space="preserve">Comunicação aos titulares (direta e individualizada)</w:t>
@@ -4099,8 +4182,9 @@
     </w:tbl>
     <w:p>
       <w:pPr>
-        <w:pStyle w:val="Heading2"/>
+        <w:pStyle w:val="Heading3"/>
         <w:spacing w:after="80" w:before="240"/>
+        <w:ind w:firstLine="0"/>
       </w:pPr>
       <w:r>
         <w:t xml:space="preserve">Divulgação pública alternativa aos titulares: execução</w:t>
@@ -4108,7 +4192,9 @@
     </w:p>
     <w:p>
       <w:pPr>
-        <w:spacing w:after="80"/>
+        <w:spacing w:after="80" w:line="360" w:lineRule="auto"/>
+        <w:ind w:firstLine="709"/>
+        <w:jc w:val="both"/>
       </w:pPr>
       <w:r>
         <w:rPr>
@@ -4498,8 +4584,9 @@
     </w:tbl>
     <w:p>
       <w:pPr>
-        <w:pStyle w:val="Heading2"/>
+        <w:pStyle w:val="Heading3"/>
         <w:spacing w:after="80" w:before="240"/>
+        <w:ind w:firstLine="0"/>
       </w:pPr>
       <w:r>
         <w:t xml:space="preserve">Declaração art. 9º, §4º (comprovação da comunicação aos titulares)</w:t>
@@ -4984,8 +5071,9 @@
     </w:tbl>
     <w:p>
       <w:pPr>
-        <w:pStyle w:val="Heading2"/>
+        <w:pStyle w:val="Heading3"/>
         <w:spacing w:after="80" w:before="240"/>
+        <w:ind w:firstLine="0"/>
       </w:pPr>
       <w:r>
         <w:t xml:space="preserve">Outras providências ou requisições relacionadas ao processo: registro nº 1</w:t>
@@ -4993,7 +5081,9 @@
     </w:p>
     <w:p>
       <w:pPr>
-        <w:spacing w:after="80"/>
+        <w:spacing w:after="80" w:line="360" w:lineRule="auto"/>
+        <w:ind w:firstLine="709"/>
+        <w:jc w:val="both"/>
       </w:pPr>
       <w:r>
         <w:rPr>
@@ -5403,6 +5493,357 @@
                 <w:szCs w:val="18"/>
               </w:rPr>
               <w:t xml:space="preserve">Evidência Comprobatória</w:t>
+            </w:r>
+          </w:p>
+        </w:tc>
+        <w:tc>
+          <w:tcPr>
+            <w:tcW w:type="dxa" w:w="6400"/>
+            <w:tcMar>
+              <w:top w:type="dxa" w:w="80"/>
+              <w:left w:type="dxa" w:w="100"/>
+              <w:bottom w:type="dxa" w:w="80"/>
+              <w:right w:type="dxa" w:w="100"/>
+            </w:tcMar>
+            <w:vAlign w:val="center"/>
+          </w:tcPr>
+          <w:p>
+            <w:r>
+              <w:rPr>
+                <w:b w:val="false"/>
+                <w:bCs w:val="false"/>
+                <w:color w:val="000000"/>
+                <w:sz w:val="20"/>
+                <w:szCs w:val="20"/>
+              </w:rPr>
+              <w:t xml:space="preserve"/>
+            </w:r>
+          </w:p>
+        </w:tc>
+      </w:tr>
+      <w:tr>
+        <w:tc>
+          <w:tcPr>
+            <w:tcW w:type="dxa" w:w="2600"/>
+            <w:shd w:fill="1F3864" w:val="clear"/>
+            <w:tcMar>
+              <w:top w:type="dxa" w:w="80"/>
+              <w:left w:type="dxa" w:w="100"/>
+              <w:bottom w:type="dxa" w:w="80"/>
+              <w:right w:type="dxa" w:w="100"/>
+            </w:tcMar>
+            <w:vAlign w:val="center"/>
+          </w:tcPr>
+          <w:p>
+            <w:r>
+              <w:rPr>
+                <w:b/>
+                <w:bCs/>
+                <w:color w:val="FFFFFF"/>
+                <w:sz w:val="18"/>
+                <w:szCs w:val="18"/>
+              </w:rPr>
+              <w:t xml:space="preserve">Situação</w:t>
+            </w:r>
+          </w:p>
+        </w:tc>
+        <w:tc>
+          <w:tcPr>
+            <w:tcW w:type="dxa" w:w="6400"/>
+            <w:tcMar>
+              <w:top w:type="dxa" w:w="80"/>
+              <w:left w:type="dxa" w:w="100"/>
+              <w:bottom w:type="dxa" w:w="80"/>
+              <w:right w:type="dxa" w:w="100"/>
+            </w:tcMar>
+            <w:vAlign w:val="center"/>
+          </w:tcPr>
+          <w:p>
+            <w:r>
+              <w:rPr>
+                <w:b w:val="false"/>
+                <w:bCs w:val="false"/>
+                <w:color w:val="000000"/>
+                <w:sz w:val="20"/>
+                <w:szCs w:val="20"/>
+              </w:rPr>
+              <w:t xml:space="preserve"/>
+            </w:r>
+          </w:p>
+        </w:tc>
+      </w:tr>
+    </w:tbl>
+    <w:p>
+      <w:pPr>
+        <w:pStyle w:val="Heading3"/>
+        <w:spacing w:after="80" w:before="240"/>
+        <w:ind w:firstLine="0"/>
+      </w:pPr>
+      <w:r>
+        <w:t xml:space="preserve">Extinção do processo de comunicação perante a ANPD</w:t>
+      </w:r>
+    </w:p>
+    <w:p>
+      <w:pPr>
+        <w:spacing w:after="80" w:line="360" w:lineRule="auto"/>
+        <w:ind w:firstLine="709"/>
+        <w:jc w:val="both"/>
+      </w:pPr>
+      <w:r>
+        <w:rPr>
+          <w:i/>
+          <w:iCs/>
+          <w:color w:val="595959"/>
+          <w:sz w:val="18"/>
+          <w:szCs w:val="18"/>
+        </w:rPr>
+        <w:t xml:space="preserve">Hipóteses previstas: (I) não identificadas evidências suficientes da ocorrência do incidente; (II) a ANPD conclui que o incidente não possui potencial de risco ou dano relevante; (III) o incidente não envolve dados pessoais; (IV) tomadas as medidas adicionais de mitigação ou reversão e comprovada a comunicação aos titulares, quando devida. A extinção não encerra o risco residual de a ANPD determinar, mesmo depois, a ampla divulgação do incidente ou outras medidas (Política, seções 10 e 14; Plano, seção 6.2): se isso ocorrer, registrar como nova providência (bloco acima), não reabrir este bloco.</w:t>
+      </w:r>
+    </w:p>
+    <w:tbl>
+      <w:tblPr>
+        <w:tblW w:type="dxa" w:w="9000"/>
+        <w:tblBorders>
+          <w:top w:val="single" w:color="auto" w:sz="4"/>
+          <w:left w:val="single" w:color="auto" w:sz="4"/>
+          <w:bottom w:val="single" w:color="auto" w:sz="4"/>
+          <w:right w:val="single" w:color="auto" w:sz="4"/>
+          <w:insideH w:val="single" w:color="auto" w:sz="4"/>
+          <w:insideV w:val="single" w:color="auto" w:sz="4"/>
+        </w:tblBorders>
+        <w:tblLayout w:type="fixed"/>
+      </w:tblPr>
+      <w:tblGrid>
+        <w:gridCol w:w="2600"/>
+        <w:gridCol w:w="6400"/>
+      </w:tblGrid>
+      <w:tr>
+        <w:tc>
+          <w:tcPr>
+            <w:tcW w:type="dxa" w:w="2600"/>
+            <w:shd w:fill="1F3864" w:val="clear"/>
+            <w:tcMar>
+              <w:top w:type="dxa" w:w="80"/>
+              <w:left w:type="dxa" w:w="100"/>
+              <w:bottom w:type="dxa" w:w="80"/>
+              <w:right w:type="dxa" w:w="100"/>
+            </w:tcMar>
+            <w:vAlign w:val="center"/>
+          </w:tcPr>
+          <w:p>
+            <w:r>
+              <w:rPr>
+                <w:b/>
+                <w:bCs/>
+                <w:color w:val="FFFFFF"/>
+                <w:sz w:val="18"/>
+                <w:szCs w:val="18"/>
+              </w:rPr>
+              <w:t xml:space="preserve">Hipótese de extinção (Resolução CD/ANPD nº 15/2024, art. 23, I a IV)</w:t>
+            </w:r>
+          </w:p>
+        </w:tc>
+        <w:tc>
+          <w:tcPr>
+            <w:tcW w:type="dxa" w:w="6400"/>
+            <w:tcMar>
+              <w:top w:type="dxa" w:w="80"/>
+              <w:left w:type="dxa" w:w="100"/>
+              <w:bottom w:type="dxa" w:w="80"/>
+              <w:right w:type="dxa" w:w="100"/>
+            </w:tcMar>
+            <w:vAlign w:val="center"/>
+          </w:tcPr>
+          <w:p>
+            <w:r>
+              <w:rPr>
+                <w:b w:val="false"/>
+                <w:bCs w:val="false"/>
+                <w:color w:val="000000"/>
+                <w:sz w:val="20"/>
+                <w:szCs w:val="20"/>
+              </w:rPr>
+              <w:t xml:space="preserve"/>
+            </w:r>
+          </w:p>
+        </w:tc>
+      </w:tr>
+      <w:tr>
+        <w:tc>
+          <w:tcPr>
+            <w:tcW w:type="dxa" w:w="2600"/>
+            <w:shd w:fill="1F3864" w:val="clear"/>
+            <w:tcMar>
+              <w:top w:type="dxa" w:w="80"/>
+              <w:left w:type="dxa" w:w="100"/>
+              <w:bottom w:type="dxa" w:w="80"/>
+              <w:right w:type="dxa" w:w="100"/>
+            </w:tcMar>
+            <w:vAlign w:val="center"/>
+          </w:tcPr>
+          <w:p>
+            <w:r>
+              <w:rPr>
+                <w:b/>
+                <w:bCs/>
+                <w:color w:val="FFFFFF"/>
+                <w:sz w:val="18"/>
+                <w:szCs w:val="18"/>
+              </w:rPr>
+              <w:t xml:space="preserve">Fundamentação registrada</w:t>
+            </w:r>
+          </w:p>
+        </w:tc>
+        <w:tc>
+          <w:tcPr>
+            <w:tcW w:type="dxa" w:w="6400"/>
+            <w:tcMar>
+              <w:top w:type="dxa" w:w="80"/>
+              <w:left w:type="dxa" w:w="100"/>
+              <w:bottom w:type="dxa" w:w="80"/>
+              <w:right w:type="dxa" w:w="100"/>
+            </w:tcMar>
+            <w:vAlign w:val="center"/>
+          </w:tcPr>
+          <w:p>
+            <w:r>
+              <w:rPr>
+                <w:b w:val="false"/>
+                <w:bCs w:val="false"/>
+                <w:color w:val="000000"/>
+                <w:sz w:val="20"/>
+                <w:szCs w:val="20"/>
+              </w:rPr>
+              <w:t xml:space="preserve"/>
+            </w:r>
+          </w:p>
+        </w:tc>
+      </w:tr>
+      <w:tr>
+        <w:tc>
+          <w:tcPr>
+            <w:tcW w:type="dxa" w:w="2600"/>
+            <w:shd w:fill="1F3864" w:val="clear"/>
+            <w:tcMar>
+              <w:top w:type="dxa" w:w="80"/>
+              <w:left w:type="dxa" w:w="100"/>
+              <w:bottom w:type="dxa" w:w="80"/>
+              <w:right w:type="dxa" w:w="100"/>
+            </w:tcMar>
+            <w:vAlign w:val="center"/>
+          </w:tcPr>
+          <w:p>
+            <w:r>
+              <w:rPr>
+                <w:b/>
+                <w:bCs/>
+                <w:color w:val="FFFFFF"/>
+                <w:sz w:val="18"/>
+                <w:szCs w:val="18"/>
+              </w:rPr>
+              <w:t xml:space="preserve">Data da extinção</w:t>
+            </w:r>
+          </w:p>
+        </w:tc>
+        <w:tc>
+          <w:tcPr>
+            <w:tcW w:type="dxa" w:w="6400"/>
+            <w:tcMar>
+              <w:top w:type="dxa" w:w="80"/>
+              <w:left w:type="dxa" w:w="100"/>
+              <w:bottom w:type="dxa" w:w="80"/>
+              <w:right w:type="dxa" w:w="100"/>
+            </w:tcMar>
+            <w:vAlign w:val="center"/>
+          </w:tcPr>
+          <w:p>
+            <w:r>
+              <w:rPr>
+                <w:b w:val="false"/>
+                <w:bCs w:val="false"/>
+                <w:color w:val="000000"/>
+                <w:sz w:val="20"/>
+                <w:szCs w:val="20"/>
+              </w:rPr>
+              <w:t xml:space="preserve"/>
+            </w:r>
+          </w:p>
+        </w:tc>
+      </w:tr>
+      <w:tr>
+        <w:tc>
+          <w:tcPr>
+            <w:tcW w:type="dxa" w:w="2600"/>
+            <w:shd w:fill="1F3864" w:val="clear"/>
+            <w:tcMar>
+              <w:top w:type="dxa" w:w="80"/>
+              <w:left w:type="dxa" w:w="100"/>
+              <w:bottom w:type="dxa" w:w="80"/>
+              <w:right w:type="dxa" w:w="100"/>
+            </w:tcMar>
+            <w:vAlign w:val="center"/>
+          </w:tcPr>
+          <w:p>
+            <w:r>
+              <w:rPr>
+                <w:b/>
+                <w:bCs/>
+                <w:color w:val="FFFFFF"/>
+                <w:sz w:val="18"/>
+                <w:szCs w:val="18"/>
+              </w:rPr>
+              <w:t xml:space="preserve">Responsável pelo registro</w:t>
+            </w:r>
+          </w:p>
+        </w:tc>
+        <w:tc>
+          <w:tcPr>
+            <w:tcW w:type="dxa" w:w="6400"/>
+            <w:tcMar>
+              <w:top w:type="dxa" w:w="80"/>
+              <w:left w:type="dxa" w:w="100"/>
+              <w:bottom w:type="dxa" w:w="80"/>
+              <w:right w:type="dxa" w:w="100"/>
+            </w:tcMar>
+            <w:vAlign w:val="center"/>
+          </w:tcPr>
+          <w:p>
+            <w:r>
+              <w:rPr>
+                <w:b w:val="false"/>
+                <w:bCs w:val="false"/>
+                <w:color w:val="000000"/>
+                <w:sz w:val="20"/>
+                <w:szCs w:val="20"/>
+              </w:rPr>
+              <w:t xml:space="preserve"/>
+            </w:r>
+          </w:p>
+        </w:tc>
+      </w:tr>
+      <w:tr>
+        <w:tc>
+          <w:tcPr>
+            <w:tcW w:type="dxa" w:w="2600"/>
+            <w:shd w:fill="1F3864" w:val="clear"/>
+            <w:tcMar>
+              <w:top w:type="dxa" w:w="80"/>
+              <w:left w:type="dxa" w:w="100"/>
+              <w:bottom w:type="dxa" w:w="80"/>
+              <w:right w:type="dxa" w:w="100"/>
+            </w:tcMar>
+            <w:vAlign w:val="center"/>
+          </w:tcPr>
+          <w:p>
+            <w:r>
+              <w:rPr>
+                <w:b/>
+                <w:bCs/>
+                <w:color w:val="FFFFFF"/>
+                <w:sz w:val="18"/>
+                <w:szCs w:val="18"/>
+              </w:rPr>
+              <w:t xml:space="preserve">Medidas adicionais determinadas pela ANPD após a extinção (se houver)</w:t>
             </w:r>
           </w:p>
         </w:tc>
@@ -5711,8 +6152,29 @@
       </w:pPr>
     </w:lvl>
   </w:abstractNum>
+  <w:abstractNum w:abstractNumId="2" w15:restartNumberingAfterBreak="0">
+    <w:multiLevelType w:val="hybridMultilevel"/>
+    <w:lvl w:ilvl="0" w:tentative="1">
+      <w:start w:val="1"/>
+      <w:numFmt w:val="upperLetter"/>
+      <w:lvlText w:val="%1."/>
+      <w:lvlJc w:val="left"/>
+    </w:lvl>
+    <w:lvl w:ilvl="1" w:tentative="1">
+      <w:start w:val="1"/>
+      <w:numFmt w:val="decimal"/>
+      <w:lvlText w:val="%1.%2"/>
+      <w:lvlJc w:val="left"/>
+    </w:lvl>
+  </w:abstractNum>
   <w:num w:numId="1">
     <w:abstractNumId w:val="1"/>
+    <w:lvlOverride w:ilvl="0">
+      <w:startOverride w:val="1"/>
+    </w:lvlOverride>
+  </w:num>
+  <w:num w:numId="2">
+    <w:abstractNumId w:val="2"/>
     <w:lvlOverride w:ilvl="0">
       <w:startOverride w:val="1"/>
     </w:lvlOverride>
@@ -5725,7 +6187,7 @@
   <w:docDefaults>
     <w:rPrDefault>
       <w:rPr>
-        <w:rFonts w:ascii="Arial" w:cs="Arial" w:eastAsia="Arial" w:hAnsi="Arial"/>
+        <w:rFonts w:ascii="Times New Roman" w:cs="Times New Roman" w:eastAsia="Times New Roman" w:hAnsi="Times New Roman"/>
         <w:sz w:val="24"/>
         <w:szCs w:val="24"/>
       </w:rPr>
@@ -5749,17 +6211,6 @@
     <w:rPr>
       <w:sz w:val="56"/>
       <w:szCs w:val="56"/>
-    </w:rPr>
-  </w:style>
-  <w:style w:type="paragraph" w:styleId="Heading3">
-    <w:name w:val="Heading 3"/>
-    <w:basedOn w:val="Normal"/>
-    <w:next w:val="Normal"/>
-    <w:qFormat/>
-    <w:rPr>
-      <w:color w:val="1F4D78"/>
-      <w:sz w:val="24"/>
-      <w:szCs w:val="24"/>
     </w:rPr>
   </w:style>
   <w:style w:type="paragraph" w:styleId="Heading4">
@@ -5894,15 +6345,21 @@
     <w:name w:val="Heading 1"/>
     <w:basedOn w:val="Normal"/>
     <w:next w:val="Normal"/>
+    <w:qFormat/>
     <w:pPr>
+      <w:numPr>
+        <w:ilvl w:val="0"/>
+        <w:numId w:val="2"/>
+      </w:numPr>
       <w:pBdr>
         <w:bottom w:val="single" w:color="1F3864" w:sz="6"/>
       </w:pBdr>
       <w:spacing w:after="160" w:before="360" w:line="240" w:lineRule="auto"/>
+      <w:ind w:firstLine="0"/>
       <w:jc w:val="left"/>
     </w:pPr>
     <w:rPr>
-      <w:rFonts w:ascii="Arial" w:cs="Arial" w:eastAsia="Arial" w:hAnsi="Arial"/>
+      <w:rFonts w:ascii="Times New Roman" w:cs="Times New Roman" w:eastAsia="Times New Roman" w:hAnsi="Times New Roman"/>
       <w:b/>
       <w:bCs/>
       <w:color w:val="1F3864"/>
@@ -5914,12 +6371,37 @@
     <w:name w:val="Heading 2"/>
     <w:basedOn w:val="Normal"/>
     <w:next w:val="Normal"/>
+    <w:qFormat/>
     <w:pPr>
+      <w:numPr>
+        <w:ilvl w:val="1"/>
+        <w:numId w:val="2"/>
+      </w:numPr>
       <w:spacing w:after="120" w:before="240" w:line="240" w:lineRule="auto"/>
+      <w:ind w:firstLine="0"/>
       <w:jc w:val="left"/>
     </w:pPr>
     <w:rPr>
-      <w:rFonts w:ascii="Arial" w:cs="Arial" w:eastAsia="Arial" w:hAnsi="Arial"/>
+      <w:rFonts w:ascii="Times New Roman" w:cs="Times New Roman" w:eastAsia="Times New Roman" w:hAnsi="Times New Roman"/>
+      <w:b/>
+      <w:bCs/>
+      <w:color w:val="2E5395"/>
+      <w:sz w:val="24"/>
+      <w:szCs w:val="24"/>
+    </w:rPr>
+  </w:style>
+  <w:style w:type="paragraph" w:styleId="Heading3">
+    <w:name w:val="Heading 3"/>
+    <w:basedOn w:val="Normal"/>
+    <w:next w:val="Normal"/>
+    <w:qFormat/>
+    <w:pPr>
+      <w:spacing w:after="120" w:before="240" w:line="240" w:lineRule="auto"/>
+      <w:ind w:firstLine="0"/>
+      <w:jc w:val="left"/>
+    </w:pPr>
+    <w:rPr>
+      <w:rFonts w:ascii="Times New Roman" w:cs="Times New Roman" w:eastAsia="Times New Roman" w:hAnsi="Times New Roman"/>
       <w:b/>
       <w:bCs/>
       <w:color w:val="2E5395"/>

</xml_diff>

<commit_message>
Incorpora melhorias DAIR/ANPD/ransomware e ABNT NBR 14724 rigorosa (#6)
Conteúdo: 4 hipóteses de extinção do processo ANPD (Resolução nº 15/2024, art. 23),
registro obrigatório do motivo de não comunicar, "ampla divulgação" como poder coercitivo
da ANPD, matriz de severidade de 3 eixos como referência opcional, novo anexo de
ransomware no Plano (autoridade de pagamento, canal fora de banda, restauração de
backups, investigação de intrusão ampla), vínculo relatório final/RIPD, indicador de
pontualidade de comunicação à ANPD, e referência à ISO 22361:2022.

Formatação: Times New Roman 12pt (substitui Arial), Sumário como campo TOC dinâmico,
títulos em estilos nativos Heading 1/2/3 do Word, numeração de títulos via lista
multinível vinculada aos estilos Heading (gerada automaticamente, nunca mais texto
manual embutido).


Claude-Session: https://claude.ai/code/session_019BUciMiJ9NpL2e53Cpz4hF

Co-authored-by: Claude <noreply@anthropic.com>
</commit_message>
<xml_diff>
--- a/instrumentos/word/DAIR_Kit_Preparacao_Comunicacoes_ANPD_Titulares_v0.3.docx
+++ b/instrumentos/word/DAIR_Kit_Preparacao_Comunicacoes_ANPD_Titulares_v0.3.docx
@@ -121,18 +121,45 @@
         <w:br w:type="page"/>
       </w:r>
     </w:p>
+    <w:sdt>
+      <w:sdtPr>
+        <w:alias w:val="Sumário"/>
+      </w:sdtPr>
+      <w:sdtContent>
+        <w:p>
+          <w:r>
+            <w:fldChar w:fldCharType="begin" w:dirty="true"/>
+            <w:instrText xml:space="preserve">TOC \h \o "1-2"</w:instrText>
+            <w:fldChar w:fldCharType="separate"/>
+          </w:r>
+        </w:p>
+        <w:p>
+          <w:r>
+            <w:fldChar w:fldCharType="end"/>
+          </w:r>
+        </w:p>
+      </w:sdtContent>
+    </w:sdt>
+    <w:p>
+      <w:r>
+        <w:br w:type="page"/>
+      </w:r>
+    </w:p>
     <w:p>
       <w:pPr>
         <w:pStyle w:val="Heading1"/>
         <w:spacing w:after="160" w:before="360"/>
+        <w:ind w:firstLine="0"/>
       </w:pPr>
       <w:r>
-        <w:t xml:space="preserve">A. Preparação para a Comunicação à ANPD</w:t>
+        <w:t xml:space="preserve">Preparação para a Comunicação à ANPD</w:t>
       </w:r>
     </w:p>
     <w:p>
       <w:pPr>
-        <w:spacing w:after="200"/>
+        <w:spacing w:after="200" w:line="360" w:lineRule="auto"/>
+        <w:ind w:firstLine="709"/>
+        <w:jc w:val="both"/>
       </w:pPr>
       <w:r>
         <w:rPr>
@@ -149,9 +176,10 @@
       <w:pPr>
         <w:pStyle w:val="Heading2"/>
         <w:spacing w:after="120" w:before="200"/>
+        <w:ind w:firstLine="0"/>
       </w:pPr>
       <w:r>
-        <w:t xml:space="preserve">A.1 Conteúdo mínimo do art. 6º, §2º, do RCIS (itens I a XII)</w:t>
+        <w:t xml:space="preserve">Conteúdo mínimo do art. 6º, §2º, do RCIS (itens I a XII)</w:t>
       </w:r>
     </w:p>
     <w:tbl>
@@ -1219,9 +1247,10 @@
       <w:pPr>
         <w:pStyle w:val="Heading2"/>
         <w:spacing w:after="120" w:before="200"/>
+        <w:ind w:firstLine="0"/>
       </w:pPr>
       <w:r>
-        <w:t xml:space="preserve">A.2 Formulário oficial e peticionamento no SEI!ANPD</w:t>
+        <w:t xml:space="preserve">Formulário oficial e peticionamento no SEI!ANPD</w:t>
       </w:r>
     </w:p>
     <w:p>
@@ -1238,7 +1267,9 @@
     </w:p>
     <w:p>
       <w:pPr>
-        <w:spacing w:after="140"/>
+        <w:spacing w:after="140" w:line="360" w:lineRule="auto"/>
+        <w:ind w:firstLine="709"/>
+        <w:jc w:val="both"/>
       </w:pPr>
       <w:r>
         <w:rPr>
@@ -1262,7 +1293,9 @@
     </w:p>
     <w:p>
       <w:pPr>
-        <w:spacing w:after="140"/>
+        <w:spacing w:after="140" w:line="360" w:lineRule="auto"/>
+        <w:ind w:firstLine="709"/>
+        <w:jc w:val="both"/>
       </w:pPr>
       <w:r>
         <w:rPr>
@@ -1288,14 +1321,17 @@
       <w:pPr>
         <w:pStyle w:val="Heading2"/>
         <w:spacing w:after="120" w:before="200"/>
+        <w:ind w:firstLine="0"/>
       </w:pPr>
       <w:r>
-        <w:t xml:space="preserve">A.3 Representação, documentos complementares e classificação de acesso</w:t>
+        <w:t xml:space="preserve">Representação, documentos complementares e classificação de acesso</w:t>
       </w:r>
     </w:p>
     <w:p>
       <w:pPr>
-        <w:spacing w:after="140"/>
+        <w:spacing w:after="140" w:line="360" w:lineRule="auto"/>
+        <w:ind w:firstLine="709"/>
+        <w:jc w:val="both"/>
       </w:pPr>
       <w:r>
         <w:rPr>
@@ -1319,7 +1355,9 @@
     </w:p>
     <w:p>
       <w:pPr>
-        <w:spacing w:after="140"/>
+        <w:spacing w:after="140" w:line="360" w:lineRule="auto"/>
+        <w:ind w:firstLine="709"/>
+        <w:jc w:val="both"/>
       </w:pPr>
       <w:r>
         <w:rPr>
@@ -1343,7 +1381,9 @@
     </w:p>
     <w:p>
       <w:pPr>
-        <w:spacing w:after="140"/>
+        <w:spacing w:after="140" w:line="360" w:lineRule="auto"/>
+        <w:ind w:firstLine="709"/>
+        <w:jc w:val="both"/>
       </w:pPr>
       <w:r>
         <w:rPr>
@@ -1705,14 +1745,17 @@
       <w:pPr>
         <w:pStyle w:val="Heading2"/>
         <w:spacing w:after="120" w:before="200"/>
+        <w:ind w:firstLine="0"/>
       </w:pPr>
       <w:r>
-        <w:t xml:space="preserve">A.4 Pendências e controle de preparação</w:t>
+        <w:t xml:space="preserve">Pendências e controle de preparação</w:t>
       </w:r>
     </w:p>
     <w:p>
       <w:pPr>
-        <w:spacing w:after="140"/>
+        <w:spacing w:after="140" w:line="360" w:lineRule="auto"/>
+        <w:ind w:firstLine="709"/>
+        <w:jc w:val="both"/>
       </w:pPr>
       <w:r>
         <w:rPr>
@@ -1736,7 +1779,9 @@
     </w:p>
     <w:p>
       <w:pPr>
-        <w:spacing w:after="140"/>
+        <w:spacing w:after="140" w:line="360" w:lineRule="auto"/>
+        <w:ind w:firstLine="709"/>
+        <w:jc w:val="both"/>
       </w:pPr>
       <w:r>
         <w:rPr>
@@ -1760,7 +1805,9 @@
     </w:p>
     <w:p>
       <w:pPr>
-        <w:spacing w:after="140"/>
+        <w:spacing w:after="140" w:line="360" w:lineRule="auto"/>
+        <w:ind w:firstLine="709"/>
+        <w:jc w:val="both"/>
       </w:pPr>
       <w:r>
         <w:rPr>
@@ -1784,7 +1831,9 @@
     </w:p>
     <w:p>
       <w:pPr>
-        <w:spacing w:after="140"/>
+        <w:spacing w:after="140" w:line="360" w:lineRule="auto"/>
+        <w:ind w:firstLine="709"/>
+        <w:jc w:val="both"/>
       </w:pPr>
       <w:r>
         <w:rPr>
@@ -1808,7 +1857,9 @@
     </w:p>
     <w:p>
       <w:pPr>
-        <w:spacing w:after="140"/>
+        <w:spacing w:after="140" w:line="360" w:lineRule="auto"/>
+        <w:ind w:firstLine="709"/>
+        <w:jc w:val="both"/>
       </w:pPr>
       <w:r>
         <w:rPr>
@@ -1832,7 +1883,9 @@
     </w:p>
     <w:p>
       <w:pPr>
-        <w:spacing w:after="140"/>
+        <w:spacing w:after="140" w:line="360" w:lineRule="auto"/>
+        <w:ind w:firstLine="709"/>
+        <w:jc w:val="both"/>
       </w:pPr>
       <w:r>
         <w:rPr>
@@ -1858,14 +1911,17 @@
       <w:pPr>
         <w:pStyle w:val="Heading1"/>
         <w:spacing w:after="160" w:before="360"/>
+        <w:ind w:firstLine="0"/>
       </w:pPr>
       <w:r>
-        <w:t xml:space="preserve">B. Preparação da Comunicação aos Titulares</w:t>
+        <w:t xml:space="preserve">Preparação da Comunicação aos Titulares</w:t>
       </w:r>
     </w:p>
     <w:p>
       <w:pPr>
-        <w:spacing w:after="200"/>
+        <w:spacing w:after="200" w:line="360" w:lineRule="auto"/>
+        <w:ind w:firstLine="709"/>
+        <w:jc w:val="both"/>
       </w:pPr>
       <w:r>
         <w:rPr>
@@ -1882,9 +1938,10 @@
       <w:pPr>
         <w:pStyle w:val="Heading2"/>
         <w:spacing w:after="120" w:before="200"/>
+        <w:ind w:firstLine="0"/>
       </w:pPr>
       <w:r>
-        <w:t xml:space="preserve">B.1 Conteúdo mínimo (art. 9º, caput): elementos obrigatórios</w:t>
+        <w:t xml:space="preserve">Conteúdo mínimo (art. 9º, caput): elementos obrigatórios</w:t>
       </w:r>
     </w:p>
     <w:tbl>
@@ -2379,14 +2436,17 @@
       <w:pPr>
         <w:pStyle w:val="Heading2"/>
         <w:spacing w:after="120" w:before="200"/>
+        <w:ind w:firstLine="0"/>
       </w:pPr>
       <w:r>
-        <w:t xml:space="preserve">B.2 Revisão de conteúdo, canal, alcance e acessibilidade</w:t>
+        <w:t xml:space="preserve">Revisão de conteúdo, canal, alcance e acessibilidade</w:t>
       </w:r>
     </w:p>
     <w:p>
       <w:pPr>
-        <w:spacing w:after="140"/>
+        <w:spacing w:after="140" w:line="360" w:lineRule="auto"/>
+        <w:ind w:firstLine="709"/>
+        <w:jc w:val="both"/>
       </w:pPr>
       <w:r>
         <w:rPr>
@@ -2410,7 +2470,9 @@
     </w:p>
     <w:p>
       <w:pPr>
-        <w:spacing w:after="140"/>
+        <w:spacing w:after="140" w:line="360" w:lineRule="auto"/>
+        <w:ind w:firstLine="709"/>
+        <w:jc w:val="both"/>
       </w:pPr>
       <w:r>
         <w:rPr>
@@ -2434,7 +2496,9 @@
     </w:p>
     <w:p>
       <w:pPr>
-        <w:spacing w:after="140"/>
+        <w:spacing w:after="140" w:line="360" w:lineRule="auto"/>
+        <w:ind w:firstLine="709"/>
+        <w:jc w:val="both"/>
       </w:pPr>
       <w:r>
         <w:rPr>
@@ -2458,7 +2522,9 @@
     </w:p>
     <w:p>
       <w:pPr>
-        <w:spacing w:after="140"/>
+        <w:spacing w:after="140" w:line="360" w:lineRule="auto"/>
+        <w:ind w:firstLine="709"/>
+        <w:jc w:val="both"/>
       </w:pPr>
       <w:r>
         <w:rPr>
@@ -2482,7 +2548,9 @@
     </w:p>
     <w:p>
       <w:pPr>
-        <w:spacing w:after="140"/>
+        <w:spacing w:after="140" w:line="360" w:lineRule="auto"/>
+        <w:ind w:firstLine="709"/>
+        <w:jc w:val="both"/>
       </w:pPr>
       <w:r>
         <w:rPr>
@@ -2508,14 +2576,17 @@
       <w:pPr>
         <w:pStyle w:val="Heading2"/>
         <w:spacing w:after="120" w:before="200"/>
+        <w:ind w:firstLine="0"/>
       </w:pPr>
       <w:r>
-        <w:t xml:space="preserve">B.3 Divulgação pública alternativa: preparação (quando a comunicação direta for inviável, art. 9º, §3º)</w:t>
+        <w:t xml:space="preserve">Divulgação pública alternativa: preparação (quando a comunicação direta for inviável, art. 9º, §3º)</w:t>
       </w:r>
     </w:p>
     <w:p>
       <w:pPr>
-        <w:spacing w:after="140"/>
+        <w:spacing w:after="140" w:line="360" w:lineRule="auto"/>
+        <w:ind w:firstLine="709"/>
+        <w:jc w:val="both"/>
       </w:pPr>
       <w:r>
         <w:rPr>
@@ -2539,7 +2610,9 @@
     </w:p>
     <w:p>
       <w:pPr>
-        <w:spacing w:after="140"/>
+        <w:spacing w:after="140" w:line="360" w:lineRule="auto"/>
+        <w:ind w:firstLine="709"/>
+        <w:jc w:val="both"/>
       </w:pPr>
       <w:r>
         <w:rPr>
@@ -2563,7 +2636,9 @@
     </w:p>
     <w:p>
       <w:pPr>
-        <w:spacing w:after="140"/>
+        <w:spacing w:after="140" w:line="360" w:lineRule="auto"/>
+        <w:ind w:firstLine="709"/>
+        <w:jc w:val="both"/>
       </w:pPr>
       <w:r>
         <w:rPr>
@@ -2589,14 +2664,17 @@
       <w:pPr>
         <w:pStyle w:val="Heading1"/>
         <w:spacing w:after="160" w:before="360"/>
+        <w:ind w:firstLine="0"/>
       </w:pPr>
       <w:r>
-        <w:t xml:space="preserve">C. Controle da Execução</w:t>
+        <w:t xml:space="preserve">Controle da Execução</w:t>
       </w:r>
     </w:p>
     <w:p>
       <w:pPr>
-        <w:spacing w:after="200"/>
+        <w:spacing w:after="200" w:line="360" w:lineRule="auto"/>
+        <w:ind w:firstLine="709"/>
+        <w:jc w:val="both"/>
       </w:pPr>
       <w:r>
         <w:rPr>
@@ -2626,8 +2704,9 @@
     </w:p>
     <w:p>
       <w:pPr>
-        <w:pStyle w:val="Heading2"/>
+        <w:pStyle w:val="Heading3"/>
         <w:spacing w:after="80" w:before="240"/>
+        <w:ind w:firstLine="0"/>
       </w:pPr>
       <w:r>
         <w:t xml:space="preserve">Comunicação inicial à ANPD</w:t>
@@ -3112,8 +3191,9 @@
     </w:tbl>
     <w:p>
       <w:pPr>
-        <w:pStyle w:val="Heading2"/>
+        <w:pStyle w:val="Heading3"/>
         <w:spacing w:after="80" w:before="240"/>
+        <w:ind w:firstLine="0"/>
       </w:pPr>
       <w:r>
         <w:t xml:space="preserve">Complementação à ANPD: registro nº 1</w:t>
@@ -3121,7 +3201,9 @@
     </w:p>
     <w:p>
       <w:pPr>
-        <w:spacing w:after="80"/>
+        <w:spacing w:after="80" w:line="360" w:lineRule="auto"/>
+        <w:ind w:firstLine="709"/>
+        <w:jc w:val="both"/>
       </w:pPr>
       <w:r>
         <w:rPr>
@@ -3613,8 +3695,9 @@
     </w:tbl>
     <w:p>
       <w:pPr>
-        <w:pStyle w:val="Heading2"/>
+        <w:pStyle w:val="Heading3"/>
         <w:spacing w:after="80" w:before="240"/>
+        <w:ind w:firstLine="0"/>
       </w:pPr>
       <w:r>
         <w:t xml:space="preserve">Comunicação aos titulares (direta e individualizada)</w:t>
@@ -4099,8 +4182,9 @@
     </w:tbl>
     <w:p>
       <w:pPr>
-        <w:pStyle w:val="Heading2"/>
+        <w:pStyle w:val="Heading3"/>
         <w:spacing w:after="80" w:before="240"/>
+        <w:ind w:firstLine="0"/>
       </w:pPr>
       <w:r>
         <w:t xml:space="preserve">Divulgação pública alternativa aos titulares: execução</w:t>
@@ -4108,7 +4192,9 @@
     </w:p>
     <w:p>
       <w:pPr>
-        <w:spacing w:after="80"/>
+        <w:spacing w:after="80" w:line="360" w:lineRule="auto"/>
+        <w:ind w:firstLine="709"/>
+        <w:jc w:val="both"/>
       </w:pPr>
       <w:r>
         <w:rPr>
@@ -4498,8 +4584,9 @@
     </w:tbl>
     <w:p>
       <w:pPr>
-        <w:pStyle w:val="Heading2"/>
+        <w:pStyle w:val="Heading3"/>
         <w:spacing w:after="80" w:before="240"/>
+        <w:ind w:firstLine="0"/>
       </w:pPr>
       <w:r>
         <w:t xml:space="preserve">Declaração art. 9º, §4º (comprovação da comunicação aos titulares)</w:t>
@@ -4984,8 +5071,9 @@
     </w:tbl>
     <w:p>
       <w:pPr>
-        <w:pStyle w:val="Heading2"/>
+        <w:pStyle w:val="Heading3"/>
         <w:spacing w:after="80" w:before="240"/>
+        <w:ind w:firstLine="0"/>
       </w:pPr>
       <w:r>
         <w:t xml:space="preserve">Outras providências ou requisições relacionadas ao processo: registro nº 1</w:t>
@@ -4993,7 +5081,9 @@
     </w:p>
     <w:p>
       <w:pPr>
-        <w:spacing w:after="80"/>
+        <w:spacing w:after="80" w:line="360" w:lineRule="auto"/>
+        <w:ind w:firstLine="709"/>
+        <w:jc w:val="both"/>
       </w:pPr>
       <w:r>
         <w:rPr>
@@ -5403,6 +5493,357 @@
                 <w:szCs w:val="18"/>
               </w:rPr>
               <w:t xml:space="preserve">Evidência Comprobatória</w:t>
+            </w:r>
+          </w:p>
+        </w:tc>
+        <w:tc>
+          <w:tcPr>
+            <w:tcW w:type="dxa" w:w="6400"/>
+            <w:tcMar>
+              <w:top w:type="dxa" w:w="80"/>
+              <w:left w:type="dxa" w:w="100"/>
+              <w:bottom w:type="dxa" w:w="80"/>
+              <w:right w:type="dxa" w:w="100"/>
+            </w:tcMar>
+            <w:vAlign w:val="center"/>
+          </w:tcPr>
+          <w:p>
+            <w:r>
+              <w:rPr>
+                <w:b w:val="false"/>
+                <w:bCs w:val="false"/>
+                <w:color w:val="000000"/>
+                <w:sz w:val="20"/>
+                <w:szCs w:val="20"/>
+              </w:rPr>
+              <w:t xml:space="preserve"/>
+            </w:r>
+          </w:p>
+        </w:tc>
+      </w:tr>
+      <w:tr>
+        <w:tc>
+          <w:tcPr>
+            <w:tcW w:type="dxa" w:w="2600"/>
+            <w:shd w:fill="1F3864" w:val="clear"/>
+            <w:tcMar>
+              <w:top w:type="dxa" w:w="80"/>
+              <w:left w:type="dxa" w:w="100"/>
+              <w:bottom w:type="dxa" w:w="80"/>
+              <w:right w:type="dxa" w:w="100"/>
+            </w:tcMar>
+            <w:vAlign w:val="center"/>
+          </w:tcPr>
+          <w:p>
+            <w:r>
+              <w:rPr>
+                <w:b/>
+                <w:bCs/>
+                <w:color w:val="FFFFFF"/>
+                <w:sz w:val="18"/>
+                <w:szCs w:val="18"/>
+              </w:rPr>
+              <w:t xml:space="preserve">Situação</w:t>
+            </w:r>
+          </w:p>
+        </w:tc>
+        <w:tc>
+          <w:tcPr>
+            <w:tcW w:type="dxa" w:w="6400"/>
+            <w:tcMar>
+              <w:top w:type="dxa" w:w="80"/>
+              <w:left w:type="dxa" w:w="100"/>
+              <w:bottom w:type="dxa" w:w="80"/>
+              <w:right w:type="dxa" w:w="100"/>
+            </w:tcMar>
+            <w:vAlign w:val="center"/>
+          </w:tcPr>
+          <w:p>
+            <w:r>
+              <w:rPr>
+                <w:b w:val="false"/>
+                <w:bCs w:val="false"/>
+                <w:color w:val="000000"/>
+                <w:sz w:val="20"/>
+                <w:szCs w:val="20"/>
+              </w:rPr>
+              <w:t xml:space="preserve"/>
+            </w:r>
+          </w:p>
+        </w:tc>
+      </w:tr>
+    </w:tbl>
+    <w:p>
+      <w:pPr>
+        <w:pStyle w:val="Heading3"/>
+        <w:spacing w:after="80" w:before="240"/>
+        <w:ind w:firstLine="0"/>
+      </w:pPr>
+      <w:r>
+        <w:t xml:space="preserve">Extinção do processo de comunicação perante a ANPD</w:t>
+      </w:r>
+    </w:p>
+    <w:p>
+      <w:pPr>
+        <w:spacing w:after="80" w:line="360" w:lineRule="auto"/>
+        <w:ind w:firstLine="709"/>
+        <w:jc w:val="both"/>
+      </w:pPr>
+      <w:r>
+        <w:rPr>
+          <w:i/>
+          <w:iCs/>
+          <w:color w:val="595959"/>
+          <w:sz w:val="18"/>
+          <w:szCs w:val="18"/>
+        </w:rPr>
+        <w:t xml:space="preserve">Hipóteses previstas: (I) não identificadas evidências suficientes da ocorrência do incidente; (II) a ANPD conclui que o incidente não possui potencial de risco ou dano relevante; (III) o incidente não envolve dados pessoais; (IV) tomadas as medidas adicionais de mitigação ou reversão e comprovada a comunicação aos titulares, quando devida. A extinção não encerra o risco residual de a ANPD determinar, mesmo depois, a ampla divulgação do incidente ou outras medidas (Política, seções 10 e 14; Plano, seção 6.2): se isso ocorrer, registrar como nova providência (bloco acima), não reabrir este bloco.</w:t>
+      </w:r>
+    </w:p>
+    <w:tbl>
+      <w:tblPr>
+        <w:tblW w:type="dxa" w:w="9000"/>
+        <w:tblBorders>
+          <w:top w:val="single" w:color="auto" w:sz="4"/>
+          <w:left w:val="single" w:color="auto" w:sz="4"/>
+          <w:bottom w:val="single" w:color="auto" w:sz="4"/>
+          <w:right w:val="single" w:color="auto" w:sz="4"/>
+          <w:insideH w:val="single" w:color="auto" w:sz="4"/>
+          <w:insideV w:val="single" w:color="auto" w:sz="4"/>
+        </w:tblBorders>
+        <w:tblLayout w:type="fixed"/>
+      </w:tblPr>
+      <w:tblGrid>
+        <w:gridCol w:w="2600"/>
+        <w:gridCol w:w="6400"/>
+      </w:tblGrid>
+      <w:tr>
+        <w:tc>
+          <w:tcPr>
+            <w:tcW w:type="dxa" w:w="2600"/>
+            <w:shd w:fill="1F3864" w:val="clear"/>
+            <w:tcMar>
+              <w:top w:type="dxa" w:w="80"/>
+              <w:left w:type="dxa" w:w="100"/>
+              <w:bottom w:type="dxa" w:w="80"/>
+              <w:right w:type="dxa" w:w="100"/>
+            </w:tcMar>
+            <w:vAlign w:val="center"/>
+          </w:tcPr>
+          <w:p>
+            <w:r>
+              <w:rPr>
+                <w:b/>
+                <w:bCs/>
+                <w:color w:val="FFFFFF"/>
+                <w:sz w:val="18"/>
+                <w:szCs w:val="18"/>
+              </w:rPr>
+              <w:t xml:space="preserve">Hipótese de extinção (Resolução CD/ANPD nº 15/2024, art. 23, I a IV)</w:t>
+            </w:r>
+          </w:p>
+        </w:tc>
+        <w:tc>
+          <w:tcPr>
+            <w:tcW w:type="dxa" w:w="6400"/>
+            <w:tcMar>
+              <w:top w:type="dxa" w:w="80"/>
+              <w:left w:type="dxa" w:w="100"/>
+              <w:bottom w:type="dxa" w:w="80"/>
+              <w:right w:type="dxa" w:w="100"/>
+            </w:tcMar>
+            <w:vAlign w:val="center"/>
+          </w:tcPr>
+          <w:p>
+            <w:r>
+              <w:rPr>
+                <w:b w:val="false"/>
+                <w:bCs w:val="false"/>
+                <w:color w:val="000000"/>
+                <w:sz w:val="20"/>
+                <w:szCs w:val="20"/>
+              </w:rPr>
+              <w:t xml:space="preserve"/>
+            </w:r>
+          </w:p>
+        </w:tc>
+      </w:tr>
+      <w:tr>
+        <w:tc>
+          <w:tcPr>
+            <w:tcW w:type="dxa" w:w="2600"/>
+            <w:shd w:fill="1F3864" w:val="clear"/>
+            <w:tcMar>
+              <w:top w:type="dxa" w:w="80"/>
+              <w:left w:type="dxa" w:w="100"/>
+              <w:bottom w:type="dxa" w:w="80"/>
+              <w:right w:type="dxa" w:w="100"/>
+            </w:tcMar>
+            <w:vAlign w:val="center"/>
+          </w:tcPr>
+          <w:p>
+            <w:r>
+              <w:rPr>
+                <w:b/>
+                <w:bCs/>
+                <w:color w:val="FFFFFF"/>
+                <w:sz w:val="18"/>
+                <w:szCs w:val="18"/>
+              </w:rPr>
+              <w:t xml:space="preserve">Fundamentação registrada</w:t>
+            </w:r>
+          </w:p>
+        </w:tc>
+        <w:tc>
+          <w:tcPr>
+            <w:tcW w:type="dxa" w:w="6400"/>
+            <w:tcMar>
+              <w:top w:type="dxa" w:w="80"/>
+              <w:left w:type="dxa" w:w="100"/>
+              <w:bottom w:type="dxa" w:w="80"/>
+              <w:right w:type="dxa" w:w="100"/>
+            </w:tcMar>
+            <w:vAlign w:val="center"/>
+          </w:tcPr>
+          <w:p>
+            <w:r>
+              <w:rPr>
+                <w:b w:val="false"/>
+                <w:bCs w:val="false"/>
+                <w:color w:val="000000"/>
+                <w:sz w:val="20"/>
+                <w:szCs w:val="20"/>
+              </w:rPr>
+              <w:t xml:space="preserve"/>
+            </w:r>
+          </w:p>
+        </w:tc>
+      </w:tr>
+      <w:tr>
+        <w:tc>
+          <w:tcPr>
+            <w:tcW w:type="dxa" w:w="2600"/>
+            <w:shd w:fill="1F3864" w:val="clear"/>
+            <w:tcMar>
+              <w:top w:type="dxa" w:w="80"/>
+              <w:left w:type="dxa" w:w="100"/>
+              <w:bottom w:type="dxa" w:w="80"/>
+              <w:right w:type="dxa" w:w="100"/>
+            </w:tcMar>
+            <w:vAlign w:val="center"/>
+          </w:tcPr>
+          <w:p>
+            <w:r>
+              <w:rPr>
+                <w:b/>
+                <w:bCs/>
+                <w:color w:val="FFFFFF"/>
+                <w:sz w:val="18"/>
+                <w:szCs w:val="18"/>
+              </w:rPr>
+              <w:t xml:space="preserve">Data da extinção</w:t>
+            </w:r>
+          </w:p>
+        </w:tc>
+        <w:tc>
+          <w:tcPr>
+            <w:tcW w:type="dxa" w:w="6400"/>
+            <w:tcMar>
+              <w:top w:type="dxa" w:w="80"/>
+              <w:left w:type="dxa" w:w="100"/>
+              <w:bottom w:type="dxa" w:w="80"/>
+              <w:right w:type="dxa" w:w="100"/>
+            </w:tcMar>
+            <w:vAlign w:val="center"/>
+          </w:tcPr>
+          <w:p>
+            <w:r>
+              <w:rPr>
+                <w:b w:val="false"/>
+                <w:bCs w:val="false"/>
+                <w:color w:val="000000"/>
+                <w:sz w:val="20"/>
+                <w:szCs w:val="20"/>
+              </w:rPr>
+              <w:t xml:space="preserve"/>
+            </w:r>
+          </w:p>
+        </w:tc>
+      </w:tr>
+      <w:tr>
+        <w:tc>
+          <w:tcPr>
+            <w:tcW w:type="dxa" w:w="2600"/>
+            <w:shd w:fill="1F3864" w:val="clear"/>
+            <w:tcMar>
+              <w:top w:type="dxa" w:w="80"/>
+              <w:left w:type="dxa" w:w="100"/>
+              <w:bottom w:type="dxa" w:w="80"/>
+              <w:right w:type="dxa" w:w="100"/>
+            </w:tcMar>
+            <w:vAlign w:val="center"/>
+          </w:tcPr>
+          <w:p>
+            <w:r>
+              <w:rPr>
+                <w:b/>
+                <w:bCs/>
+                <w:color w:val="FFFFFF"/>
+                <w:sz w:val="18"/>
+                <w:szCs w:val="18"/>
+              </w:rPr>
+              <w:t xml:space="preserve">Responsável pelo registro</w:t>
+            </w:r>
+          </w:p>
+        </w:tc>
+        <w:tc>
+          <w:tcPr>
+            <w:tcW w:type="dxa" w:w="6400"/>
+            <w:tcMar>
+              <w:top w:type="dxa" w:w="80"/>
+              <w:left w:type="dxa" w:w="100"/>
+              <w:bottom w:type="dxa" w:w="80"/>
+              <w:right w:type="dxa" w:w="100"/>
+            </w:tcMar>
+            <w:vAlign w:val="center"/>
+          </w:tcPr>
+          <w:p>
+            <w:r>
+              <w:rPr>
+                <w:b w:val="false"/>
+                <w:bCs w:val="false"/>
+                <w:color w:val="000000"/>
+                <w:sz w:val="20"/>
+                <w:szCs w:val="20"/>
+              </w:rPr>
+              <w:t xml:space="preserve"/>
+            </w:r>
+          </w:p>
+        </w:tc>
+      </w:tr>
+      <w:tr>
+        <w:tc>
+          <w:tcPr>
+            <w:tcW w:type="dxa" w:w="2600"/>
+            <w:shd w:fill="1F3864" w:val="clear"/>
+            <w:tcMar>
+              <w:top w:type="dxa" w:w="80"/>
+              <w:left w:type="dxa" w:w="100"/>
+              <w:bottom w:type="dxa" w:w="80"/>
+              <w:right w:type="dxa" w:w="100"/>
+            </w:tcMar>
+            <w:vAlign w:val="center"/>
+          </w:tcPr>
+          <w:p>
+            <w:r>
+              <w:rPr>
+                <w:b/>
+                <w:bCs/>
+                <w:color w:val="FFFFFF"/>
+                <w:sz w:val="18"/>
+                <w:szCs w:val="18"/>
+              </w:rPr>
+              <w:t xml:space="preserve">Medidas adicionais determinadas pela ANPD após a extinção (se houver)</w:t>
             </w:r>
           </w:p>
         </w:tc>
@@ -5711,8 +6152,29 @@
       </w:pPr>
     </w:lvl>
   </w:abstractNum>
+  <w:abstractNum w:abstractNumId="2" w15:restartNumberingAfterBreak="0">
+    <w:multiLevelType w:val="hybridMultilevel"/>
+    <w:lvl w:ilvl="0" w:tentative="1">
+      <w:start w:val="1"/>
+      <w:numFmt w:val="upperLetter"/>
+      <w:lvlText w:val="%1."/>
+      <w:lvlJc w:val="left"/>
+    </w:lvl>
+    <w:lvl w:ilvl="1" w:tentative="1">
+      <w:start w:val="1"/>
+      <w:numFmt w:val="decimal"/>
+      <w:lvlText w:val="%1.%2"/>
+      <w:lvlJc w:val="left"/>
+    </w:lvl>
+  </w:abstractNum>
   <w:num w:numId="1">
     <w:abstractNumId w:val="1"/>
+    <w:lvlOverride w:ilvl="0">
+      <w:startOverride w:val="1"/>
+    </w:lvlOverride>
+  </w:num>
+  <w:num w:numId="2">
+    <w:abstractNumId w:val="2"/>
     <w:lvlOverride w:ilvl="0">
       <w:startOverride w:val="1"/>
     </w:lvlOverride>
@@ -5725,7 +6187,7 @@
   <w:docDefaults>
     <w:rPrDefault>
       <w:rPr>
-        <w:rFonts w:ascii="Arial" w:cs="Arial" w:eastAsia="Arial" w:hAnsi="Arial"/>
+        <w:rFonts w:ascii="Times New Roman" w:cs="Times New Roman" w:eastAsia="Times New Roman" w:hAnsi="Times New Roman"/>
         <w:sz w:val="24"/>
         <w:szCs w:val="24"/>
       </w:rPr>
@@ -5749,17 +6211,6 @@
     <w:rPr>
       <w:sz w:val="56"/>
       <w:szCs w:val="56"/>
-    </w:rPr>
-  </w:style>
-  <w:style w:type="paragraph" w:styleId="Heading3">
-    <w:name w:val="Heading 3"/>
-    <w:basedOn w:val="Normal"/>
-    <w:next w:val="Normal"/>
-    <w:qFormat/>
-    <w:rPr>
-      <w:color w:val="1F4D78"/>
-      <w:sz w:val="24"/>
-      <w:szCs w:val="24"/>
     </w:rPr>
   </w:style>
   <w:style w:type="paragraph" w:styleId="Heading4">
@@ -5894,15 +6345,21 @@
     <w:name w:val="Heading 1"/>
     <w:basedOn w:val="Normal"/>
     <w:next w:val="Normal"/>
+    <w:qFormat/>
     <w:pPr>
+      <w:numPr>
+        <w:ilvl w:val="0"/>
+        <w:numId w:val="2"/>
+      </w:numPr>
       <w:pBdr>
         <w:bottom w:val="single" w:color="1F3864" w:sz="6"/>
       </w:pBdr>
       <w:spacing w:after="160" w:before="360" w:line="240" w:lineRule="auto"/>
+      <w:ind w:firstLine="0"/>
       <w:jc w:val="left"/>
     </w:pPr>
     <w:rPr>
-      <w:rFonts w:ascii="Arial" w:cs="Arial" w:eastAsia="Arial" w:hAnsi="Arial"/>
+      <w:rFonts w:ascii="Times New Roman" w:cs="Times New Roman" w:eastAsia="Times New Roman" w:hAnsi="Times New Roman"/>
       <w:b/>
       <w:bCs/>
       <w:color w:val="1F3864"/>
@@ -5914,12 +6371,37 @@
     <w:name w:val="Heading 2"/>
     <w:basedOn w:val="Normal"/>
     <w:next w:val="Normal"/>
+    <w:qFormat/>
     <w:pPr>
+      <w:numPr>
+        <w:ilvl w:val="1"/>
+        <w:numId w:val="2"/>
+      </w:numPr>
       <w:spacing w:after="120" w:before="240" w:line="240" w:lineRule="auto"/>
+      <w:ind w:firstLine="0"/>
       <w:jc w:val="left"/>
     </w:pPr>
     <w:rPr>
-      <w:rFonts w:ascii="Arial" w:cs="Arial" w:eastAsia="Arial" w:hAnsi="Arial"/>
+      <w:rFonts w:ascii="Times New Roman" w:cs="Times New Roman" w:eastAsia="Times New Roman" w:hAnsi="Times New Roman"/>
+      <w:b/>
+      <w:bCs/>
+      <w:color w:val="2E5395"/>
+      <w:sz w:val="24"/>
+      <w:szCs w:val="24"/>
+    </w:rPr>
+  </w:style>
+  <w:style w:type="paragraph" w:styleId="Heading3">
+    <w:name w:val="Heading 3"/>
+    <w:basedOn w:val="Normal"/>
+    <w:next w:val="Normal"/>
+    <w:qFormat/>
+    <w:pPr>
+      <w:spacing w:after="120" w:before="240" w:line="240" w:lineRule="auto"/>
+      <w:ind w:firstLine="0"/>
+      <w:jc w:val="left"/>
+    </w:pPr>
+    <w:rPr>
+      <w:rFonts w:ascii="Times New Roman" w:cs="Times New Roman" w:eastAsia="Times New Roman" w:hAnsi="Times New Roman"/>
       <w:b/>
       <w:bCs/>
       <w:color w:val="2E5395"/>

</xml_diff>